<commit_message>
docs(manual): redactar Capitulo 13 de Preguntas Frecuentes y Solucion de Problemas (MD y Word)
</commit_message>
<xml_diff>
--- a/docs/manual-usuario/word/00_Indice_General_Manual_Usuario.docx
+++ b/docs/manual-usuario/word/00_Indice_General_Manual_Usuario.docx
@@ -1888,6 +1888,132 @@
                 <w:szCs w:val="19"/>
               </w:rPr>
               <w:t xml:space="preserve">Propietario y Contador</w:t>
+            </w:r>
+          </w:p>
+        </w:tc>
+      </w:tr>
+      <w:tr>
+        <w:tc>
+          <w:tcPr>
+            <w:tcBorders>
+              <w:top w:val="single" w:color="E2E8F0" w:sz="4"/>
+              <w:left w:val="single" w:color="E2E8F0" w:sz="4"/>
+              <w:bottom w:val="single" w:color="E2E8F0" w:sz="4"/>
+              <w:right w:val="single" w:color="E2E8F0" w:sz="4"/>
+            </w:tcBorders>
+            <w:shd w:fill="F8FAFC" w:val="clear"/>
+            <w:tcMar>
+              <w:top w:type="dxa" w:w="100"/>
+              <w:left w:type="dxa" w:w="120"/>
+              <w:bottom w:type="dxa" w:w="100"/>
+              <w:right w:type="dxa" w:w="120"/>
+            </w:tcMar>
+          </w:tcPr>
+          <w:p>
+            <w:pPr>
+              <w:jc w:val="left"/>
+            </w:pPr>
+            <w:r>
+              <w:rPr>
+                <w:rFonts w:ascii="Calibri" w:cs="Calibri" w:eastAsia="Calibri" w:hAnsi="Calibri"/>
+                <w:color w:val="334155"/>
+                <w:sz w:val="19"/>
+                <w:szCs w:val="19"/>
+              </w:rPr>
+              <w:t xml:space="preserve">[</w:t>
+            </w:r>
+            <w:r>
+              <w:rPr>
+                <w:rFonts w:ascii="Calibri" w:cs="Calibri" w:eastAsia="Calibri" w:hAnsi="Calibri"/>
+                <w:b/>
+                <w:bCs/>
+                <w:color w:val="334155"/>
+                <w:sz w:val="19"/>
+                <w:szCs w:val="19"/>
+              </w:rPr>
+              <w:t xml:space="preserve">Capítulo 13</w:t>
+            </w:r>
+            <w:r>
+              <w:rPr>
+                <w:rFonts w:ascii="Calibri" w:cs="Calibri" w:eastAsia="Calibri" w:hAnsi="Calibri"/>
+                <w:color w:val="334155"/>
+                <w:sz w:val="19"/>
+                <w:szCs w:val="19"/>
+              </w:rPr>
+              <w:t xml:space="preserve">](13_PREGUNTAS_FRECUENTES_Y_SOLUCION_PROBLEMAS.md)</w:t>
+            </w:r>
+          </w:p>
+        </w:tc>
+        <w:tc>
+          <w:tcPr>
+            <w:tcBorders>
+              <w:top w:val="single" w:color="E2E8F0" w:sz="4"/>
+              <w:left w:val="single" w:color="E2E8F0" w:sz="4"/>
+              <w:bottom w:val="single" w:color="E2E8F0" w:sz="4"/>
+              <w:right w:val="single" w:color="E2E8F0" w:sz="4"/>
+            </w:tcBorders>
+            <w:shd w:fill="F8FAFC" w:val="clear"/>
+            <w:tcMar>
+              <w:top w:type="dxa" w:w="100"/>
+              <w:left w:type="dxa" w:w="120"/>
+              <w:bottom w:type="dxa" w:w="100"/>
+              <w:right w:type="dxa" w:w="120"/>
+            </w:tcMar>
+          </w:tcPr>
+          <w:p>
+            <w:pPr>
+              <w:jc w:val="left"/>
+            </w:pPr>
+            <w:r>
+              <w:rPr>
+                <w:rFonts w:ascii="Calibri" w:cs="Calibri" w:eastAsia="Calibri" w:hAnsi="Calibri"/>
+                <w:b/>
+                <w:bCs/>
+                <w:color w:val="334155"/>
+                <w:sz w:val="19"/>
+                <w:szCs w:val="19"/>
+              </w:rPr>
+              <w:t xml:space="preserve">Preguntas Frecuentes, Dudas de Mostrador y Solución de Problemas</w:t>
+            </w:r>
+            <w:r>
+              <w:rPr>
+                <w:rFonts w:ascii="Calibri" w:cs="Calibri" w:eastAsia="Calibri" w:hAnsi="Calibri"/>
+                <w:color w:val="334155"/>
+                <w:sz w:val="19"/>
+                <w:szCs w:val="19"/>
+              </w:rPr>
+              <w:t xml:space="preserve">&lt;br&gt;Guía rápida con las 40 dudas cotidianas más comunes de la tienda física: fallas de internet, descuadres de caja, prendas en stock cero, pagos mixtos, clientes morosos, cancelaciones de separe y seguridad de empleados.</w:t>
+            </w:r>
+          </w:p>
+        </w:tc>
+        <w:tc>
+          <w:tcPr>
+            <w:tcBorders>
+              <w:top w:val="single" w:color="E2E8F0" w:sz="4"/>
+              <w:left w:val="single" w:color="E2E8F0" w:sz="4"/>
+              <w:bottom w:val="single" w:color="E2E8F0" w:sz="4"/>
+              <w:right w:val="single" w:color="E2E8F0" w:sz="4"/>
+            </w:tcBorders>
+            <w:shd w:fill="F8FAFC" w:val="clear"/>
+            <w:tcMar>
+              <w:top w:type="dxa" w:w="100"/>
+              <w:left w:type="dxa" w:w="120"/>
+              <w:bottom w:type="dxa" w:w="100"/>
+              <w:right w:type="dxa" w:w="120"/>
+            </w:tcMar>
+          </w:tcPr>
+          <w:p>
+            <w:pPr>
+              <w:jc w:val="left"/>
+            </w:pPr>
+            <w:r>
+              <w:rPr>
+                <w:rFonts w:ascii="Calibri" w:cs="Calibri" w:eastAsia="Calibri" w:hAnsi="Calibri"/>
+                <w:color w:val="334155"/>
+                <w:sz w:val="19"/>
+                <w:szCs w:val="19"/>
+              </w:rPr>
+              <w:t xml:space="preserve">Todos (Cajeros y Dueño)</w:t>
             </w:r>
           </w:p>
         </w:tc>

</xml_diff>